<commit_message>
feat: wire SmartArt dispatch end-to-end, add opt-out setting
A chain/tree/cycle-shaped diagram now exports as a native, editable Word
SmartArt graphic instead of the OOXML canvas shapes every diagram
previously got, with automatic fallback (plus a visible in-document note)
for anything classifyTopology rejects. Wired through core's
parser/translator, the pandoc-filter bridge, the CLI, and the VS Code
extension.

Adds `md2nativedocx.smartArt.enabled` (default: on) to force the canvas
fallback for every diagram instead, via a new
MD2NATIVEDOCX_DISABLE_SMARTART env var the CLI now honours — for a
reviewer workflow that wants one consistent shape rendering across a
whole document. Localized into all 6 supported languages, covered by a
new CLI test.

Co-Authored-By: Claude Sonnet 5 <noreply@anthropic.com>
</commit_message>
<xml_diff>
--- a/test-corpus/corpus/generated/large2.docx
+++ b/test-corpus/corpus/generated/large2.docx
@@ -2998,6 +2998,19 @@
             </a:graphic>
           </wp:inline>
         </w:drawing>
+      </w:r>
+    </w:p>
+    <w:p xmlns:w="http://schemas.openxmlformats.org/wordprocessingml/2006/main">
+      <w:pPr>
+        <w:spacing w:before="0" w:after="120"/>
+      </w:pPr>
+      <w:r>
+        <w:rPr>
+          <w:i/>
+          <w:color w:val="808080"/>
+          <w:sz w:val="18"/>
+        </w:rPr>
+        <w:t xml:space="preserve">Native shapes used (nested subgraph detected — not supported by SmartArt export).</w:t>
       </w:r>
     </w:p>
     <w:bookmarkEnd w:id="20"/>

</xml_diff>

<commit_message>
chore(corpus): regenerate test-corpus/corpus/generated/ against current pipeline
The committed corpus was stale: mixed-content.docx still embedded a
SmartArt diagram (word/diagrams/) from before SmartArt was flipped
off-by-default, and medium3.docx predates the layout crash fix in the
previous commit -- it used to silently fall back to raw ```mermaid text.

Regenerated all 11 files via `node scripts/generate-corpus.mjs` so the
committed corpus reflects what the tool actually produces today.
</commit_message>
<xml_diff>
--- a/test-corpus/corpus/generated/large2.docx
+++ b/test-corpus/corpus/generated/large2.docx
@@ -15,7 +15,7 @@
       <w:r>
         <w:drawing>
           <wp:inline xmlns:wp="http://schemas.openxmlformats.org/drawingml/2006/wordprocessingDrawing" distT="0" distB="0" distL="0" distR="0">
-            <wp:extent cx="5943600" cy="694772"/>
+            <wp:extent cx="5943600" cy="842236"/>
             <wp:effectExtent l="0" t="0" r="0" b="0"/>
             <wp:docPr id="1" name="Diagram 1"/>
             <wp:cNvGraphicFramePr>
@@ -35,8 +35,8 @@
                     <wps:cNvSpPr/>
                     <wps:spPr>
                       <a:xfrm>
-                        <a:off x="0" y="22187"/>
-                        <a:ext cx="843869" cy="366826"/>
+                        <a:off x="0" y="1211"/>
+                        <a:ext cx="838458" cy="420392"/>
                       </a:xfrm>
                       <a:prstGeom prst="rect">
                         <a:avLst/>
@@ -60,8 +60,8 @@
                     <wps:cNvSpPr/>
                     <wps:spPr>
                       <a:xfrm>
-                        <a:off x="0" y="22187"/>
-                        <a:ext cx="843869" cy="20285"/>
+                        <a:off x="0" y="1211"/>
+                        <a:ext cx="838458" cy="23247"/>
                       </a:xfrm>
                       <a:prstGeom prst="rect">
                         <a:avLst/>
@@ -88,15 +88,15 @@
                         </w:p>
                       </w:txbxContent>
                     </wps:txbx>
-                    <wps:bodyPr lIns="8114" tIns="4057" rIns="8114" bIns="4057" anchor="ctr" anchorCtr="0"/>
+                    <wps:bodyPr lIns="9299" tIns="4649" rIns="9299" bIns="4649" anchor="ctr" anchorCtr="0"/>
                   </wps:wsp>
                   <wps:wsp>
                     <wps:cNvPr id="4" name="2. Bhgwangl Mrnhw Szwpapvmrgoo Pdmdx (container)"/>
                     <wps:cNvSpPr/>
                     <wps:spPr>
                       <a:xfrm>
-                        <a:off x="911487" y="0"/>
-                        <a:ext cx="522009" cy="339357"/>
+                        <a:off x="915950" y="0"/>
+                        <a:ext cx="481997" cy="388911"/>
                       </a:xfrm>
                       <a:prstGeom prst="rect">
                         <a:avLst/>
@@ -120,8 +120,8 @@
                     <wps:cNvSpPr/>
                     <wps:spPr>
                       <a:xfrm>
-                        <a:off x="911487" y="0"/>
-                        <a:ext cx="522009" cy="20285"/>
+                        <a:off x="915950" y="0"/>
+                        <a:ext cx="481997" cy="23247"/>
                       </a:xfrm>
                       <a:prstGeom prst="rect">
                         <a:avLst/>
@@ -148,15 +148,15 @@
                         </w:p>
                       </w:txbxContent>
                     </wps:txbx>
-                    <wps:bodyPr lIns="8114" tIns="4057" rIns="8114" bIns="4057" anchor="ctr" anchorCtr="0"/>
+                    <wps:bodyPr lIns="9299" tIns="4649" rIns="9299" bIns="4649" anchor="ctr" anchorCtr="0"/>
                   </wps:wsp>
                   <wps:wsp>
                     <wps:cNvPr id="6" name="Dldl Xpxjxhbthl: Pvzqahyhbyvlra, Bnqtafeyowgb &amp; Mktpccerxcm Yrskupij (container)"/>
                     <wps:cNvSpPr/>
                     <wps:spPr>
                       <a:xfrm>
-                        <a:off x="112245" y="402537"/>
-                        <a:ext cx="1" cy="20285"/>
+                        <a:off x="136773" y="437101"/>
+                        <a:ext cx="1" cy="23247"/>
                       </a:xfrm>
                       <a:prstGeom prst="rect">
                         <a:avLst/>
@@ -180,8 +180,8 @@
                     <wps:cNvSpPr/>
                     <wps:spPr>
                       <a:xfrm>
-                        <a:off x="112245" y="402537"/>
-                        <a:ext cx="1" cy="20285"/>
+                        <a:off x="136773" y="437101"/>
+                        <a:ext cx="1" cy="23247"/>
                       </a:xfrm>
                       <a:prstGeom prst="rect">
                         <a:avLst/>
@@ -208,15 +208,15 @@
                         </w:p>
                       </w:txbxContent>
                     </wps:txbx>
-                    <wps:bodyPr lIns="8114" tIns="4057" rIns="8114" bIns="4057" anchor="ctr" anchorCtr="0"/>
+                    <wps:bodyPr lIns="9299" tIns="4649" rIns="9299" bIns="4649" anchor="ctr" anchorCtr="0"/>
                   </wps:wsp>
                   <wps:wsp>
                     <wps:cNvPr id="8" name="3-5. Zqanykds &amp; Bnqtafeyowgb Vwywkk (container)"/>
                     <wps:cNvSpPr/>
                     <wps:spPr>
                       <a:xfrm>
-                        <a:off x="1501114" y="39303"/>
-                        <a:ext cx="1687063" cy="384787"/>
+                        <a:off x="1475439" y="23247"/>
+                        <a:ext cx="1626547" cy="433710"/>
                       </a:xfrm>
                       <a:prstGeom prst="rect">
                         <a:avLst/>
@@ -240,8 +240,8 @@
                     <wps:cNvSpPr/>
                     <wps:spPr>
                       <a:xfrm>
-                        <a:off x="1501114" y="39303"/>
-                        <a:ext cx="1687063" cy="20285"/>
+                        <a:off x="1475439" y="23247"/>
+                        <a:ext cx="1626547" cy="23247"/>
                       </a:xfrm>
                       <a:prstGeom prst="rect">
                         <a:avLst/>
@@ -268,15 +268,15 @@
                         </w:p>
                       </w:txbxContent>
                     </wps:txbx>
-                    <wps:bodyPr lIns="8114" tIns="4057" rIns="8114" bIns="4057" anchor="ctr" anchorCtr="0"/>
+                    <wps:bodyPr lIns="9299" tIns="4649" rIns="9299" bIns="4649" anchor="ctr" anchorCtr="0"/>
                   </wps:wsp>
                   <wps:wsp>
                     <wps:cNvPr id="10" name="6 &amp; 8. Mktpccerxcm Yrskupij &amp; Yhip Iczvdvrjqkp (container)"/>
                     <wps:cNvSpPr/>
                     <wps:spPr>
                       <a:xfrm>
-                        <a:off x="4151054" y="229478"/>
-                        <a:ext cx="499695" cy="395353"/>
+                        <a:off x="4205465" y="241192"/>
+                        <a:ext cx="572662" cy="513624"/>
                       </a:xfrm>
                       <a:prstGeom prst="rect">
                         <a:avLst/>
@@ -300,8 +300,8 @@
                     <wps:cNvSpPr/>
                     <wps:spPr>
                       <a:xfrm>
-                        <a:off x="4151054" y="229478"/>
-                        <a:ext cx="499695" cy="20285"/>
+                        <a:off x="4205465" y="241192"/>
+                        <a:ext cx="572662" cy="23247"/>
                       </a:xfrm>
                       <a:prstGeom prst="rect">
                         <a:avLst/>
@@ -328,15 +328,15 @@
                         </w:p>
                       </w:txbxContent>
                     </wps:txbx>
-                    <wps:bodyPr lIns="8114" tIns="4057" rIns="8114" bIns="4057" anchor="ctr" anchorCtr="0"/>
+                    <wps:bodyPr lIns="9299" tIns="4649" rIns="9299" bIns="4649" anchor="ctr" anchorCtr="0"/>
                   </wps:wsp>
                   <wps:wsp>
                     <wps:cNvPr id="12" name="6. Mktpccerxcm Qcls Iblouzkhkx (Mrnhw NAH) (container)"/>
                     <wps:cNvSpPr/>
                     <wps:spPr>
                       <a:xfrm>
-                        <a:off x="2785175" y="440994"/>
-                        <a:ext cx="1298261" cy="253778"/>
+                        <a:off x="2795894" y="534449"/>
+                        <a:ext cx="1332079" cy="307787"/>
                       </a:xfrm>
                       <a:prstGeom prst="rect">
                         <a:avLst/>
@@ -360,8 +360,8 @@
                     <wps:cNvSpPr/>
                     <wps:spPr>
                       <a:xfrm>
-                        <a:off x="2785175" y="440994"/>
-                        <a:ext cx="1298261" cy="20285"/>
+                        <a:off x="2795894" y="534449"/>
+                        <a:ext cx="1332079" cy="23247"/>
                       </a:xfrm>
                       <a:prstGeom prst="rect">
                         <a:avLst/>
@@ -388,15 +388,15 @@
                         </w:p>
                       </w:txbxContent>
                     </wps:txbx>
-                    <wps:bodyPr lIns="8114" tIns="4057" rIns="8114" bIns="4057" anchor="ctr" anchorCtr="0"/>
+                    <wps:bodyPr lIns="9299" tIns="4649" rIns="9299" bIns="4649" anchor="ctr" anchorCtr="0"/>
                   </wps:wsp>
                   <wps:wsp>
                     <wps:cNvPr id="14" name="Erxriuy Laqrnarxe &amp; Bhgwangl Dvhsxcjp (container)"/>
                     <wps:cNvSpPr/>
                     <wps:spPr>
                       <a:xfrm>
-                        <a:off x="112245" y="453250"/>
-                        <a:ext cx="1" cy="20285"/>
+                        <a:off x="136773" y="495219"/>
+                        <a:ext cx="1" cy="23247"/>
                       </a:xfrm>
                       <a:prstGeom prst="rect">
                         <a:avLst/>
@@ -420,8 +420,8 @@
                     <wps:cNvSpPr/>
                     <wps:spPr>
                       <a:xfrm>
-                        <a:off x="112245" y="453250"/>
-                        <a:ext cx="1" cy="20285"/>
+                        <a:off x="136773" y="495219"/>
+                        <a:ext cx="1" cy="23247"/>
                       </a:xfrm>
                       <a:prstGeom prst="rect">
                         <a:avLst/>
@@ -448,15 +448,15 @@
                         </w:p>
                       </w:txbxContent>
                     </wps:txbx>
-                    <wps:bodyPr lIns="8114" tIns="4057" rIns="8114" bIns="4057" anchor="ctr" anchorCtr="0"/>
+                    <wps:bodyPr lIns="9299" tIns="4649" rIns="9299" bIns="4649" anchor="ctr" anchorCtr="0"/>
                   </wps:wsp>
                   <wps:wsp>
                     <wps:cNvPr id="16" name="9. Erxriuy Pvzqahyhbyvlra Pdmdx (container)"/>
                     <wps:cNvSpPr/>
                     <wps:spPr>
                       <a:xfrm>
-                        <a:off x="4718366" y="61490"/>
-                        <a:ext cx="499695" cy="496779"/>
+                        <a:off x="4855619" y="68047"/>
+                        <a:ext cx="509894" cy="638336"/>
                       </a:xfrm>
                       <a:prstGeom prst="rect">
                         <a:avLst/>
@@ -480,8 +480,8 @@
                     <wps:cNvSpPr/>
                     <wps:spPr>
                       <a:xfrm>
-                        <a:off x="4718366" y="61490"/>
-                        <a:ext cx="499695" cy="20285"/>
+                        <a:off x="4855619" y="68047"/>
+                        <a:ext cx="509894" cy="23247"/>
                       </a:xfrm>
                       <a:prstGeom prst="rect">
                         <a:avLst/>
@@ -508,15 +508,15 @@
                         </w:p>
                       </w:txbxContent>
                     </wps:txbx>
-                    <wps:bodyPr lIns="8114" tIns="4057" rIns="8114" bIns="4057" anchor="ctr" anchorCtr="0"/>
+                    <wps:bodyPr lIns="9299" tIns="4649" rIns="9299" bIns="4649" anchor="ctr" anchorCtr="0"/>
                   </wps:wsp>
                   <wps:wsp>
                     <wps:cNvPr id="18" name="10. Erxriuy Dvhsxcjp &amp; Bhgwangl Lnquwua Pdmdx (container)"/>
                     <wps:cNvSpPr/>
                     <wps:spPr>
                       <a:xfrm>
-                        <a:off x="5285679" y="222082"/>
-                        <a:ext cx="657921" cy="252721"/>
+                        <a:off x="5443005" y="298100"/>
+                        <a:ext cx="500595" cy="304154"/>
                       </a:xfrm>
                       <a:prstGeom prst="rect">
                         <a:avLst/>
@@ -540,8 +540,8 @@
                     <wps:cNvSpPr/>
                     <wps:spPr>
                       <a:xfrm>
-                        <a:off x="5285679" y="222082"/>
-                        <a:ext cx="657921" cy="20285"/>
+                        <a:off x="5443005" y="298100"/>
+                        <a:ext cx="500595" cy="23247"/>
                       </a:xfrm>
                       <a:prstGeom prst="rect">
                         <a:avLst/>
@@ -568,15 +568,15 @@
                         </w:p>
                       </w:txbxContent>
                     </wps:txbx>
-                    <wps:bodyPr lIns="8114" tIns="4057" rIns="8114" bIns="4057" anchor="ctr" anchorCtr="0"/>
+                    <wps:bodyPr lIns="9299" tIns="4649" rIns="9299" bIns="4649" anchor="ctr" anchorCtr="0"/>
                   </wps:wsp>
                   <wps:wsp>
                     <wps:cNvPr id="20" name="Nmhbgc (container)"/>
                     <wps:cNvSpPr/>
                     <wps:spPr>
                       <a:xfrm>
-                        <a:off x="112245" y="503964"/>
-                        <a:ext cx="1" cy="20285"/>
+                        <a:off x="0" y="533965"/>
+                        <a:ext cx="273545" cy="289625"/>
                       </a:xfrm>
                       <a:prstGeom prst="rect">
                         <a:avLst/>
@@ -600,8 +600,8 @@
                     <wps:cNvSpPr/>
                     <wps:spPr>
                       <a:xfrm>
-                        <a:off x="112245" y="503964"/>
-                        <a:ext cx="1" cy="20285"/>
+                        <a:off x="0" y="533965"/>
+                        <a:ext cx="273545" cy="23247"/>
                       </a:xfrm>
                       <a:prstGeom prst="rect">
                         <a:avLst/>
@@ -628,15 +628,15 @@
                         </w:p>
                       </w:txbxContent>
                     </wps:txbx>
-                    <wps:bodyPr lIns="8114" tIns="4057" rIns="8114" bIns="4057" anchor="ctr" anchorCtr="0"/>
+                    <wps:bodyPr lIns="9299" tIns="4649" rIns="9299" bIns="4649" anchor="ctr" anchorCtr="0"/>
                   </wps:wsp>
                   <wps:wsp>
                     <wps:cNvPr id="22" name="Gnqjmqqpr / AQLz" descr="E1"/>
                     <wps:cNvSpPr/>
                     <wps:spPr>
                       <a:xfrm>
-                        <a:off x="33809" y="76281"/>
-                        <a:ext cx="156873" cy="88748"/>
+                        <a:off x="46882" y="63204"/>
+                        <a:ext cx="179780" cy="101708"/>
                       </a:xfrm>
                       <a:prstGeom prst="can">
                         <a:avLst/>
@@ -684,7 +684,7 @@
                         </w:p>
                       </w:txbxContent>
                     </wps:txbx>
-                    <wps:bodyPr rot="0" spcFirstLastPara="0" vertOverflow="overflow" horzOverflow="overflow" vert="horz" wrap="square" lIns="8114" tIns="4057" rIns="8114" bIns="4057" numCol="1" spcCol="0" rtlCol="0" fromWordArt="0" anchor="ctr" anchorCtr="0" forceAA="0" compatLnSpc="1">
+                    <wps:bodyPr rot="0" spcFirstLastPara="0" vertOverflow="overflow" horzOverflow="overflow" vert="horz" wrap="square" lIns="9299" tIns="4649" rIns="9299" bIns="4649" numCol="1" spcCol="0" rtlCol="0" fromWordArt="0" anchor="ctr" anchorCtr="0" forceAA="0" compatLnSpc="1">
                       <a:prstTxWarp prst="textNoShape">
                         <a:avLst/>
                       </a:prstTxWarp>
@@ -696,8 +696,8 @@
                     <wps:cNvSpPr/>
                     <wps:spPr>
                       <a:xfrm>
-                        <a:off x="42937" y="253778"/>
-                        <a:ext cx="138616" cy="88748"/>
+                        <a:off x="57344" y="266619"/>
+                        <a:ext cx="158858" cy="101708"/>
                       </a:xfrm>
                       <a:prstGeom prst="roundRect">
                         <a:avLst/>
@@ -745,7 +745,7 @@
                         </w:p>
                       </w:txbxContent>
                     </wps:txbx>
-                    <wps:bodyPr rot="0" spcFirstLastPara="0" vertOverflow="overflow" horzOverflow="overflow" vert="horz" wrap="square" lIns="8114" tIns="4057" rIns="8114" bIns="4057" numCol="1" spcCol="0" rtlCol="0" fromWordArt="0" anchor="ctr" anchorCtr="0" forceAA="0" compatLnSpc="1">
+                    <wps:bodyPr rot="0" spcFirstLastPara="0" vertOverflow="overflow" horzOverflow="overflow" vert="horz" wrap="square" lIns="9299" tIns="4649" rIns="9299" bIns="4649" numCol="1" spcCol="0" rtlCol="0" fromWordArt="0" anchor="ctr" anchorCtr="0" forceAA="0" compatLnSpc="1">
                       <a:prstTxWarp prst="textNoShape">
                         <a:avLst/>
                       </a:prstTxWarp>
@@ -757,8 +757,8 @@
                     <wps:cNvSpPr/>
                     <wps:spPr>
                       <a:xfrm>
-                        <a:off x="258300" y="139673"/>
-                        <a:ext cx="138616" cy="88748"/>
+                        <a:off x="351037" y="160068"/>
+                        <a:ext cx="158858" cy="101708"/>
                       </a:xfrm>
                       <a:prstGeom prst="rect">
                         <a:avLst/>
@@ -806,7 +806,7 @@
                         </w:p>
                       </w:txbxContent>
                     </wps:txbx>
-                    <wps:bodyPr rot="0" spcFirstLastPara="0" vertOverflow="overflow" horzOverflow="overflow" vert="horz" wrap="square" lIns="8114" tIns="4057" rIns="8114" bIns="4057" numCol="1" spcCol="0" rtlCol="0" fromWordArt="0" anchor="ctr" anchorCtr="0" forceAA="0" compatLnSpc="1">
+                    <wps:bodyPr rot="0" spcFirstLastPara="0" vertOverflow="overflow" horzOverflow="overflow" vert="horz" wrap="square" lIns="9299" tIns="4649" rIns="9299" bIns="4649" numCol="1" spcCol="0" rtlCol="0" fromWordArt="0" anchor="ctr" anchorCtr="0" forceAA="0" compatLnSpc="1">
                       <a:prstTxWarp prst="textNoShape">
                         <a:avLst/>
                       </a:prstTxWarp>
@@ -814,12 +814,12 @@
                     </wps:bodyPr>
                   </wps:wsp>
                   <wps:wsp>
-                    <wps:cNvPr id="25" name="Kapsgahlhzf Brhqtfq&lt;br/&gt;ezi, mau, ynu, aqvi, mpwioja" descr="C1"/>
+                    <wps:cNvPr id="25" name="Kapsgahlhzf Brhqtfq ezi, mau, ynu, aqvi, mpwioja" descr="C1"/>
                     <wps:cNvSpPr/>
                     <wps:spPr>
                       <a:xfrm>
-                        <a:off x="525390" y="215743"/>
-                        <a:ext cx="223815" cy="139462"/>
+                        <a:off x="590873" y="223030"/>
+                        <a:ext cx="205353" cy="159826"/>
                       </a:xfrm>
                       <a:prstGeom prst="roundRect">
                         <a:avLst/>
@@ -862,12 +862,12 @@
                               <w:color w:val="000000"/>
                               <w:sz w:val="4"/>
                             </w:rPr>
-                            <w:t xml:space="preserve">Kapsgahlhzf Brhqtfq&lt;br/&gt;ezi, mau, ynu, aqvi, mpwioja</w:t>
+                            <w:t xml:space="preserve">Kapsgahlhzf Brhqtfq ezi, mau, ynu, aqvi, mpwioja</w:t>
                           </w:r>
                         </w:p>
                       </w:txbxContent>
                     </wps:txbx>
-                    <wps:bodyPr rot="0" spcFirstLastPara="0" vertOverflow="overflow" horzOverflow="overflow" vert="horz" wrap="square" lIns="8114" tIns="4057" rIns="8114" bIns="4057" numCol="1" spcCol="0" rtlCol="0" fromWordArt="0" anchor="ctr" anchorCtr="0" forceAA="0" compatLnSpc="1">
+                    <wps:bodyPr rot="0" spcFirstLastPara="0" vertOverflow="overflow" horzOverflow="overflow" vert="horz" wrap="square" lIns="9299" tIns="4649" rIns="9299" bIns="4649" numCol="1" spcCol="0" rtlCol="0" fromWordArt="0" anchor="ctr" anchorCtr="0" forceAA="0" compatLnSpc="1">
                       <a:prstTxWarp prst="textNoShape">
                         <a:avLst/>
                       </a:prstTxWarp>
@@ -875,12 +875,12 @@
                     </wps:bodyPr>
                   </wps:wsp>
                   <wps:wsp>
-                    <wps:cNvPr id="26" name="Hlbt Ekaregrm&lt;br/&gt;nzom_agztdtss" descr="C1y"/>
+                    <wps:cNvPr id="26" name="Hlbt Ekaregrm nzom_agztdtss" descr="C1y"/>
                     <wps:cNvSpPr/>
                     <wps:spPr>
                       <a:xfrm>
-                        <a:off x="464534" y="76281"/>
-                        <a:ext cx="345527" cy="88748"/>
+                        <a:off x="587386" y="63204"/>
+                        <a:ext cx="212327" cy="101708"/>
                       </a:xfrm>
                       <a:prstGeom prst="roundRect">
                         <a:avLst/>
@@ -923,12 +923,12 @@
                               <w:color w:val="000000"/>
                               <w:sz w:val="4"/>
                             </w:rPr>
-                            <w:t xml:space="preserve">Hlbt Ekaregrm&lt;br/&gt;nzom_agztdtss</w:t>
+                            <w:t xml:space="preserve">Hlbt Ekaregrm nzom_agztdtss</w:t>
                           </w:r>
                         </w:p>
                       </w:txbxContent>
                     </wps:txbx>
-                    <wps:bodyPr rot="0" spcFirstLastPara="0" vertOverflow="overflow" horzOverflow="overflow" vert="horz" wrap="square" lIns="8114" tIns="4057" rIns="8114" bIns="4057" numCol="1" spcCol="0" rtlCol="0" fromWordArt="0" anchor="ctr" anchorCtr="0" forceAA="0" compatLnSpc="1">
+                    <wps:bodyPr rot="0" spcFirstLastPara="0" vertOverflow="overflow" horzOverflow="overflow" vert="horz" wrap="square" lIns="9299" tIns="4649" rIns="9299" bIns="4649" numCol="1" spcCol="0" rtlCol="0" fromWordArt="0" anchor="ctr" anchorCtr="0" forceAA="0" compatLnSpc="1">
                       <a:prstTxWarp prst="textNoShape">
                         <a:avLst/>
                       </a:prstTxWarp>
@@ -940,8 +940,8 @@
                     <wps:cNvSpPr/>
                     <wps:spPr>
                       <a:xfrm>
-                        <a:off x="945296" y="126995"/>
-                        <a:ext cx="114274" cy="114105"/>
+                        <a:off x="954696" y="145539"/>
+                        <a:ext cx="130961" cy="130767"/>
                       </a:xfrm>
                       <a:prstGeom prst="rect">
                         <a:avLst/>
@@ -989,7 +989,7 @@
                         </w:p>
                       </w:txbxContent>
                     </wps:txbx>
-                    <wps:bodyPr rot="0" spcFirstLastPara="0" vertOverflow="overflow" horzOverflow="overflow" vert="horz" wrap="square" lIns="8114" tIns="4057" rIns="8114" bIns="4057" numCol="1" spcCol="0" rtlCol="0" fromWordArt="0" anchor="ctr" anchorCtr="0" forceAA="0" compatLnSpc="1">
+                    <wps:bodyPr rot="0" spcFirstLastPara="0" vertOverflow="overflow" horzOverflow="overflow" vert="horz" wrap="square" lIns="9299" tIns="4649" rIns="9299" bIns="4649" numCol="1" spcCol="0" rtlCol="0" fromWordArt="0" anchor="ctr" anchorCtr="0" forceAA="0" compatLnSpc="1">
                       <a:prstTxWarp prst="textNoShape">
                         <a:avLst/>
                       </a:prstTxWarp>
@@ -997,12 +997,12 @@
                     </wps:bodyPr>
                   </wps:wsp>
                   <wps:wsp>
-                    <wps:cNvPr id="28" name="Bhgwangl Mrnhw Wbnypu&lt;br/&gt;deei/lamr mpxalugo, umcd_fivln, c_duepu/lse" descr="T2"/>
+                    <wps:cNvPr id="28" name="Bhgwangl Mrnhw Wbnypu deei/lamr mpxalugo, umcd_fivln, c_duepu/lse" descr="T2"/>
                     <wps:cNvSpPr/>
                     <wps:spPr>
                       <a:xfrm>
-                        <a:off x="1127188" y="88960"/>
-                        <a:ext cx="272500" cy="190175"/>
+                        <a:off x="1163148" y="101950"/>
+                        <a:ext cx="196054" cy="217945"/>
                       </a:xfrm>
                       <a:prstGeom prst="roundRect">
                         <a:avLst/>
@@ -1045,12 +1045,12 @@
                               <w:color w:val="000000"/>
                               <w:sz w:val="4"/>
                             </w:rPr>
-                            <w:t xml:space="preserve">Bhgwangl Mrnhw Wbnypu&lt;br/&gt;deei/lamr mpxalugo, umcd_fivln, c_duepu/lse</w:t>
+                            <w:t xml:space="preserve">Bhgwangl Mrnhw Wbnypu deei/lamr mpxalugo, umcd_fivln, c_duepu/lse</w:t>
                           </w:r>
                         </w:p>
                       </w:txbxContent>
                     </wps:txbx>
-                    <wps:bodyPr rot="0" spcFirstLastPara="0" vertOverflow="overflow" horzOverflow="overflow" vert="horz" wrap="square" lIns="8114" tIns="4057" rIns="8114" bIns="4057" numCol="1" spcCol="0" rtlCol="0" fromWordArt="0" anchor="ctr" anchorCtr="0" forceAA="0" compatLnSpc="1">
+                    <wps:bodyPr rot="0" spcFirstLastPara="0" vertOverflow="overflow" horzOverflow="overflow" vert="horz" wrap="square" lIns="9299" tIns="4649" rIns="9299" bIns="4649" numCol="1" spcCol="0" rtlCol="0" fromWordArt="0" anchor="ctr" anchorCtr="0" forceAA="0" compatLnSpc="1">
                       <a:prstTxWarp prst="textNoShape">
                         <a:avLst/>
                       </a:prstTxWarp>
@@ -1058,12 +1058,12 @@
                     </wps:bodyPr>
                   </wps:wsp>
                   <wps:wsp>
-                    <wps:cNvPr id="29" name="3. TMN Zqanykds&lt;br/&gt;Cqiogds Pjyskpt" descr="B3"/>
+                    <wps:cNvPr id="29" name="3. TMN Zqanykds Cqiogds Pjyskpt" descr="B3"/>
                     <wps:cNvSpPr/>
                     <wps:spPr>
                       <a:xfrm>
-                        <a:off x="1534923" y="200106"/>
-                        <a:ext cx="274528" cy="114105"/>
+                        <a:off x="1514184" y="213586"/>
+                        <a:ext cx="144909" cy="159826"/>
                       </a:xfrm>
                       <a:prstGeom prst="rect">
                         <a:avLst/>
@@ -1106,12 +1106,12 @@
                               <w:color w:val="000000"/>
                               <w:sz w:val="4"/>
                             </w:rPr>
-                            <w:t xml:space="preserve">3. TMN Zqanykds&lt;br/&gt;Cqiogds Pjyskpt</w:t>
+                            <w:t xml:space="preserve">3. TMN Zqanykds Cqiogds Pjyskpt</w:t>
                           </w:r>
                         </w:p>
                       </w:txbxContent>
                     </wps:txbx>
-                    <wps:bodyPr rot="0" spcFirstLastPara="0" vertOverflow="overflow" horzOverflow="overflow" vert="horz" wrap="square" lIns="8114" tIns="4057" rIns="8114" bIns="4057" numCol="1" spcCol="0" rtlCol="0" fromWordArt="0" anchor="ctr" anchorCtr="0" forceAA="0" compatLnSpc="1">
+                    <wps:bodyPr rot="0" spcFirstLastPara="0" vertOverflow="overflow" horzOverflow="overflow" vert="horz" wrap="square" lIns="9299" tIns="4649" rIns="9299" bIns="4649" numCol="1" spcCol="0" rtlCol="0" fromWordArt="0" anchor="ctr" anchorCtr="0" forceAA="0" compatLnSpc="1">
                       <a:prstTxWarp prst="textNoShape">
                         <a:avLst/>
                       </a:prstTxWarp>
@@ -1123,8 +1123,8 @@
                     <wps:cNvSpPr/>
                     <wps:spPr>
                       <a:xfrm>
-                        <a:off x="1877069" y="212785"/>
-                        <a:ext cx="150788" cy="88748"/>
+                        <a:off x="1736585" y="242645"/>
+                        <a:ext cx="172806" cy="101708"/>
                       </a:xfrm>
                       <a:prstGeom prst="roundRect">
                         <a:avLst/>
@@ -1172,7 +1172,7 @@
                         </w:p>
                       </w:txbxContent>
                     </wps:txbx>
-                    <wps:bodyPr rot="0" spcFirstLastPara="0" vertOverflow="overflow" horzOverflow="overflow" vert="horz" wrap="square" lIns="8114" tIns="4057" rIns="8114" bIns="4057" numCol="1" spcCol="0" rtlCol="0" fromWordArt="0" anchor="ctr" anchorCtr="0" forceAA="0" compatLnSpc="1">
+                    <wps:bodyPr rot="0" spcFirstLastPara="0" vertOverflow="overflow" horzOverflow="overflow" vert="horz" wrap="square" lIns="9299" tIns="4649" rIns="9299" bIns="4649" numCol="1" spcCol="0" rtlCol="0" fromWordArt="0" anchor="ctr" anchorCtr="0" forceAA="0" compatLnSpc="1">
                       <a:prstTxWarp prst="textNoShape">
                         <a:avLst/>
                       </a:prstTxWarp>
@@ -1184,8 +1184,8 @@
                     <wps:cNvSpPr/>
                     <wps:spPr>
                       <a:xfrm>
-                        <a:off x="2095474" y="263498"/>
-                        <a:ext cx="175130" cy="114105"/>
+                        <a:off x="1986883" y="280180"/>
+                        <a:ext cx="200703" cy="130767"/>
                       </a:xfrm>
                       <a:prstGeom prst="rect">
                         <a:avLst/>
@@ -1233,7 +1233,7 @@
                         </w:p>
                       </w:txbxContent>
                     </wps:txbx>
-                    <wps:bodyPr rot="0" spcFirstLastPara="0" vertOverflow="overflow" horzOverflow="overflow" vert="horz" wrap="square" lIns="8114" tIns="4057" rIns="8114" bIns="4057" numCol="1" spcCol="0" rtlCol="0" fromWordArt="0" anchor="ctr" anchorCtr="0" forceAA="0" compatLnSpc="1">
+                    <wps:bodyPr rot="0" spcFirstLastPara="0" vertOverflow="overflow" horzOverflow="overflow" vert="horz" wrap="square" lIns="9299" tIns="4649" rIns="9299" bIns="4649" numCol="1" spcCol="0" rtlCol="0" fromWordArt="0" anchor="ctr" anchorCtr="0" forceAA="0" compatLnSpc="1">
                       <a:prstTxWarp prst="textNoShape">
                         <a:avLst/>
                       </a:prstTxWarp>
@@ -1241,12 +1241,12 @@
                     </wps:bodyPr>
                   </wps:wsp>
                   <wps:wsp>
-                    <wps:cNvPr id="32" name="Hlbt Yhip Hefaki &amp;&lt;br/&gt;Jtjg Xqwvx Ztp-H" descr="L4"/>
+                    <wps:cNvPr id="32" name="Hlbt Yhip Hefaki &amp; Jtjg Xqwvx Ztp-H" descr="L4"/>
                     <wps:cNvSpPr/>
                     <wps:spPr>
                       <a:xfrm>
-                        <a:off x="2338222" y="250820"/>
-                        <a:ext cx="160930" cy="139462"/>
+                        <a:off x="2265077" y="280180"/>
+                        <a:ext cx="203028" cy="130767"/>
                       </a:xfrm>
                       <a:prstGeom prst="roundRect">
                         <a:avLst/>
@@ -1289,12 +1289,12 @@
                               <w:color w:val="000000"/>
                               <w:sz w:val="4"/>
                             </w:rPr>
-                            <w:t xml:space="preserve">Hlbt Yhip Hefaki &amp;&lt;br/&gt;Jtjg Xqwvx Ztp-H</w:t>
+                            <w:t xml:space="preserve">Hlbt Yhip Hefaki &amp; Jtjg Xqwvx Ztp-H</w:t>
                           </w:r>
                         </w:p>
                       </w:txbxContent>
                     </wps:txbx>
-                    <wps:bodyPr rot="0" spcFirstLastPara="0" vertOverflow="overflow" horzOverflow="overflow" vert="horz" wrap="square" lIns="8114" tIns="4057" rIns="8114" bIns="4057" numCol="1" spcCol="0" rtlCol="0" fromWordArt="0" anchor="ctr" anchorCtr="0" forceAA="0" compatLnSpc="1">
+                    <wps:bodyPr rot="0" spcFirstLastPara="0" vertOverflow="overflow" horzOverflow="overflow" vert="horz" wrap="square" lIns="9299" tIns="4649" rIns="9299" bIns="4649" numCol="1" spcCol="0" rtlCol="0" fromWordArt="0" anchor="ctr" anchorCtr="0" forceAA="0" compatLnSpc="1">
                       <a:prstTxWarp prst="textNoShape">
                         <a:avLst/>
                       </a:prstTxWarp>
@@ -1306,8 +1306,8 @@
                     <wps:cNvSpPr/>
                     <wps:spPr>
                       <a:xfrm>
-                        <a:off x="2566770" y="106075"/>
-                        <a:ext cx="150788" cy="114105"/>
+                        <a:off x="2545597" y="99770"/>
+                        <a:ext cx="172806" cy="130767"/>
                       </a:xfrm>
                       <a:prstGeom prst="rect">
                         <a:avLst/>
@@ -1355,7 +1355,7 @@
                         </w:p>
                       </w:txbxContent>
                     </wps:txbx>
-                    <wps:bodyPr rot="0" spcFirstLastPara="0" vertOverflow="overflow" horzOverflow="overflow" vert="horz" wrap="square" lIns="8114" tIns="4057" rIns="8114" bIns="4057" numCol="1" spcCol="0" rtlCol="0" fromWordArt="0" anchor="ctr" anchorCtr="0" forceAA="0" compatLnSpc="1">
+                    <wps:bodyPr rot="0" spcFirstLastPara="0" vertOverflow="overflow" horzOverflow="overflow" vert="horz" wrap="square" lIns="9299" tIns="4649" rIns="9299" bIns="4649" numCol="1" spcCol="0" rtlCol="0" fromWordArt="0" anchor="ctr" anchorCtr="0" forceAA="0" compatLnSpc="1">
                       <a:prstTxWarp prst="textNoShape">
                         <a:avLst/>
                       </a:prstTxWarp>
@@ -1363,12 +1363,12 @@
                     </wps:bodyPr>
                   </wps:wsp>
                   <wps:wsp>
-                    <wps:cNvPr id="34" name="Golpmjxb Pvzqahyhbyvlra&lt;br/&gt;Xqwvx, Dfyhs, Rrcsfnbksv" descr="N5"/>
+                    <wps:cNvPr id="34" name="Golpmjxb Pvzqahyhbyvlra Xqwvx, Dfyhs, Rrcsfnbksv" descr="N5"/>
                     <wps:cNvSpPr/>
                     <wps:spPr>
                       <a:xfrm>
-                        <a:off x="2818984" y="93397"/>
-                        <a:ext cx="335384" cy="139462"/>
+                        <a:off x="2834640" y="85241"/>
+                        <a:ext cx="228600" cy="159826"/>
                       </a:xfrm>
                       <a:prstGeom prst="roundRect">
                         <a:avLst/>
@@ -1411,12 +1411,12 @@
                               <w:color w:val="000000"/>
                               <w:sz w:val="4"/>
                             </w:rPr>
-                            <w:t xml:space="preserve">Golpmjxb Pvzqahyhbyvlra&lt;br/&gt;Xqwvx, Dfyhs, Rrcsfnbksv</w:t>
+                            <w:t xml:space="preserve">Golpmjxb Pvzqahyhbyvlra Xqwvx, Dfyhs, Rrcsfnbksv</w:t>
                           </w:r>
                         </w:p>
                       </w:txbxContent>
                     </wps:txbx>
-                    <wps:bodyPr rot="0" spcFirstLastPara="0" vertOverflow="overflow" horzOverflow="overflow" vert="horz" wrap="square" lIns="8114" tIns="4057" rIns="8114" bIns="4057" numCol="1" spcCol="0" rtlCol="0" fromWordArt="0" anchor="ctr" anchorCtr="0" forceAA="0" compatLnSpc="1">
+                    <wps:bodyPr rot="0" spcFirstLastPara="0" vertOverflow="overflow" horzOverflow="overflow" vert="horz" wrap="square" lIns="9299" tIns="4649" rIns="9299" bIns="4649" numCol="1" spcCol="0" rtlCol="0" fromWordArt="0" anchor="ctr" anchorCtr="0" forceAA="0" compatLnSpc="1">
                       <a:prstTxWarp prst="textNoShape">
                         <a:avLst/>
                       </a:prstTxWarp>
@@ -1428,8 +1428,8 @@
                     <wps:cNvSpPr/>
                     <wps:spPr>
                       <a:xfrm>
-                        <a:off x="2917368" y="565876"/>
-                        <a:ext cx="138616" cy="88748"/>
+                        <a:off x="2869511" y="694518"/>
+                        <a:ext cx="158858" cy="101708"/>
                       </a:xfrm>
                       <a:prstGeom prst="roundRect">
                         <a:avLst/>
@@ -1477,7 +1477,7 @@
                         </w:p>
                       </w:txbxContent>
                     </wps:txbx>
-                    <wps:bodyPr rot="0" spcFirstLastPara="0" vertOverflow="overflow" horzOverflow="overflow" vert="horz" wrap="square" lIns="8114" tIns="4057" rIns="8114" bIns="4057" numCol="1" spcCol="0" rtlCol="0" fromWordArt="0" anchor="ctr" anchorCtr="0" forceAA="0" compatLnSpc="1">
+                    <wps:bodyPr rot="0" spcFirstLastPara="0" vertOverflow="overflow" horzOverflow="overflow" vert="horz" wrap="square" lIns="9299" tIns="4649" rIns="9299" bIns="4649" numCol="1" spcCol="0" rtlCol="0" fromWordArt="0" anchor="ctr" anchorCtr="0" forceAA="0" compatLnSpc="1">
                       <a:prstTxWarp prst="textNoShape">
                         <a:avLst/>
                       </a:prstTxWarp>
@@ -1489,8 +1489,8 @@
                     <wps:cNvSpPr/>
                     <wps:spPr>
                       <a:xfrm>
-                        <a:off x="3255795" y="539463"/>
-                        <a:ext cx="138616" cy="63392"/>
+                        <a:off x="3179477" y="647296"/>
+                        <a:ext cx="158858" cy="72648"/>
                       </a:xfrm>
                       <a:prstGeom prst="rect">
                         <a:avLst/>
@@ -1538,7 +1538,7 @@
                         </w:p>
                       </w:txbxContent>
                     </wps:txbx>
-                    <wps:bodyPr rot="0" spcFirstLastPara="0" vertOverflow="overflow" horzOverflow="overflow" vert="horz" wrap="square" lIns="8114" tIns="4057" rIns="8114" bIns="4057" numCol="1" spcCol="0" rtlCol="0" fromWordArt="0" anchor="ctr" anchorCtr="0" forceAA="0" compatLnSpc="1">
+                    <wps:bodyPr rot="0" spcFirstLastPara="0" vertOverflow="overflow" horzOverflow="overflow" vert="horz" wrap="square" lIns="9299" tIns="4649" rIns="9299" bIns="4649" numCol="1" spcCol="0" rtlCol="0" fromWordArt="0" anchor="ctr" anchorCtr="0" forceAA="0" compatLnSpc="1">
                       <a:prstTxWarp prst="textNoShape">
                         <a:avLst/>
                       </a:prstTxWarp>
@@ -1550,8 +1550,8 @@
                     <wps:cNvSpPr/>
                     <wps:spPr>
                       <a:xfrm>
-                        <a:off x="3462029" y="514106"/>
-                        <a:ext cx="138616" cy="114105"/>
+                        <a:off x="3415826" y="618237"/>
+                        <a:ext cx="158858" cy="130767"/>
                       </a:xfrm>
                       <a:prstGeom prst="roundRect">
                         <a:avLst/>
@@ -1599,7 +1599,7 @@
                         </w:p>
                       </w:txbxContent>
                     </wps:txbx>
-                    <wps:bodyPr rot="0" spcFirstLastPara="0" vertOverflow="overflow" horzOverflow="overflow" vert="horz" wrap="square" lIns="8114" tIns="4057" rIns="8114" bIns="4057" numCol="1" spcCol="0" rtlCol="0" fromWordArt="0" anchor="ctr" anchorCtr="0" forceAA="0" compatLnSpc="1">
+                    <wps:bodyPr rot="0" spcFirstLastPara="0" vertOverflow="overflow" horzOverflow="overflow" vert="horz" wrap="square" lIns="9299" tIns="4649" rIns="9299" bIns="4649" numCol="1" spcCol="0" rtlCol="0" fromWordArt="0" anchor="ctr" anchorCtr="0" forceAA="0" compatLnSpc="1">
                       <a:prstTxWarp prst="textNoShape">
                         <a:avLst/>
                       </a:prstTxWarp>
@@ -1611,8 +1611,8 @@
                     <wps:cNvSpPr/>
                     <wps:spPr>
                       <a:xfrm>
-                        <a:off x="3668263" y="578554"/>
-                        <a:ext cx="187301" cy="63392"/>
+                        <a:off x="3652176" y="709047"/>
+                        <a:ext cx="214652" cy="72648"/>
                       </a:xfrm>
                       <a:prstGeom prst="rect">
                         <a:avLst/>
@@ -1660,7 +1660,7 @@
                         </w:p>
                       </w:txbxContent>
                     </wps:txbx>
-                    <wps:bodyPr rot="0" spcFirstLastPara="0" vertOverflow="overflow" horzOverflow="overflow" vert="horz" wrap="square" lIns="8114" tIns="4057" rIns="8114" bIns="4057" numCol="1" spcCol="0" rtlCol="0" fromWordArt="0" anchor="ctr" anchorCtr="0" forceAA="0" compatLnSpc="1">
+                    <wps:bodyPr rot="0" spcFirstLastPara="0" vertOverflow="overflow" horzOverflow="overflow" vert="horz" wrap="square" lIns="9299" tIns="4649" rIns="9299" bIns="4649" numCol="1" spcCol="0" rtlCol="0" fromWordArt="0" anchor="ctr" anchorCtr="0" forceAA="0" compatLnSpc="1">
                       <a:prstTxWarp prst="textNoShape">
                         <a:avLst/>
                       </a:prstTxWarp>
@@ -1672,8 +1672,8 @@
                     <wps:cNvSpPr/>
                     <wps:spPr>
                       <a:xfrm>
-                        <a:off x="3923182" y="565876"/>
-                        <a:ext cx="126445" cy="88748"/>
+                        <a:off x="3944319" y="694518"/>
+                        <a:ext cx="144909" cy="101708"/>
                       </a:xfrm>
                       <a:prstGeom prst="roundRect">
                         <a:avLst/>
@@ -1721,7 +1721,7 @@
                         </w:p>
                       </w:txbxContent>
                     </wps:txbx>
-                    <wps:bodyPr rot="0" spcFirstLastPara="0" vertOverflow="overflow" horzOverflow="overflow" vert="horz" wrap="square" lIns="8114" tIns="4057" rIns="8114" bIns="4057" numCol="1" spcCol="0" rtlCol="0" fromWordArt="0" anchor="ctr" anchorCtr="0" forceAA="0" compatLnSpc="1">
+                    <wps:bodyPr rot="0" spcFirstLastPara="0" vertOverflow="overflow" horzOverflow="overflow" vert="horz" wrap="square" lIns="9299" tIns="4649" rIns="9299" bIns="4649" numCol="1" spcCol="0" rtlCol="0" fromWordArt="0" anchor="ctr" anchorCtr="0" forceAA="0" compatLnSpc="1">
                       <a:prstTxWarp prst="textNoShape">
                         <a:avLst/>
                       </a:prstTxWarp>
@@ -1733,8 +1733,8 @@
                     <wps:cNvSpPr/>
                     <wps:spPr>
                       <a:xfrm>
-                        <a:off x="4184862" y="397677"/>
-                        <a:ext cx="181216" cy="114105"/>
+                        <a:off x="4244211" y="571984"/>
+                        <a:ext cx="207677" cy="130767"/>
                       </a:xfrm>
                       <a:prstGeom prst="rect">
                         <a:avLst/>
@@ -1782,7 +1782,7 @@
                         </w:p>
                       </w:txbxContent>
                     </wps:txbx>
-                    <wps:bodyPr rot="0" spcFirstLastPara="0" vertOverflow="overflow" horzOverflow="overflow" vert="horz" wrap="square" lIns="8114" tIns="4057" rIns="8114" bIns="4057" numCol="1" spcCol="0" rtlCol="0" fromWordArt="0" anchor="ctr" anchorCtr="0" forceAA="0" compatLnSpc="1">
+                    <wps:bodyPr rot="0" spcFirstLastPara="0" vertOverflow="overflow" horzOverflow="overflow" vert="horz" wrap="square" lIns="9299" tIns="4649" rIns="9299" bIns="4649" numCol="1" spcCol="0" rtlCol="0" fromWordArt="0" anchor="ctr" anchorCtr="0" forceAA="0" compatLnSpc="1">
                       <a:prstTxWarp prst="textNoShape">
                         <a:avLst/>
                       </a:prstTxWarp>
@@ -1794,8 +1794,8 @@
                     <wps:cNvSpPr/>
                     <wps:spPr>
                       <a:xfrm>
-                        <a:off x="4433696" y="397677"/>
-                        <a:ext cx="183244" cy="114105"/>
+                        <a:off x="4529380" y="571984"/>
+                        <a:ext cx="210002" cy="130767"/>
                       </a:xfrm>
                       <a:prstGeom prst="roundRect">
                         <a:avLst/>
@@ -1843,7 +1843,7 @@
                         </w:p>
                       </w:txbxContent>
                     </wps:txbx>
-                    <wps:bodyPr rot="0" spcFirstLastPara="0" vertOverflow="overflow" horzOverflow="overflow" vert="horz" wrap="square" lIns="8114" tIns="4057" rIns="8114" bIns="4057" numCol="1" spcCol="0" rtlCol="0" fromWordArt="0" anchor="ctr" anchorCtr="0" forceAA="0" compatLnSpc="1">
+                    <wps:bodyPr rot="0" spcFirstLastPara="0" vertOverflow="overflow" horzOverflow="overflow" vert="horz" wrap="square" lIns="9299" tIns="4649" rIns="9299" bIns="4649" numCol="1" spcCol="0" rtlCol="0" fromWordArt="0" anchor="ctr" anchorCtr="0" forceAA="0" compatLnSpc="1">
                       <a:prstTxWarp prst="textNoShape">
                         <a:avLst/>
                       </a:prstTxWarp>
@@ -1855,8 +1855,8 @@
                     <wps:cNvSpPr/>
                     <wps:spPr>
                       <a:xfrm>
-                        <a:off x="4752175" y="288855"/>
-                        <a:ext cx="126445" cy="114105"/>
+                        <a:off x="4894365" y="389153"/>
+                        <a:ext cx="144909" cy="130767"/>
                       </a:xfrm>
                       <a:prstGeom prst="rect">
                         <a:avLst/>
@@ -1904,7 +1904,7 @@
                         </w:p>
                       </w:txbxContent>
                     </wps:txbx>
-                    <wps:bodyPr rot="0" spcFirstLastPara="0" vertOverflow="overflow" horzOverflow="overflow" vert="horz" wrap="square" lIns="8114" tIns="4057" rIns="8114" bIns="4057" numCol="1" spcCol="0" rtlCol="0" fromWordArt="0" anchor="ctr" anchorCtr="0" forceAA="0" compatLnSpc="1">
+                    <wps:bodyPr rot="0" spcFirstLastPara="0" vertOverflow="overflow" horzOverflow="overflow" vert="horz" wrap="square" lIns="9299" tIns="4649" rIns="9299" bIns="4649" numCol="1" spcCol="0" rtlCol="0" fromWordArt="0" anchor="ctr" anchorCtr="0" forceAA="0" compatLnSpc="1">
                       <a:prstTxWarp prst="textNoShape">
                         <a:avLst/>
                       </a:prstTxWarp>
@@ -1912,12 +1912,12 @@
                     </wps:bodyPr>
                   </wps:wsp>
                   <wps:wsp>
-                    <wps:cNvPr id="43" name="Erxriuy Ezfvqi&lt;br/&gt;Xqwvx, Dfyhs, Ariwj, Fypq Wbnypu" descr="P9"/>
+                    <wps:cNvPr id="43" name="Erxriuy Ezfvqi Xqwvx, Dfyhs, Ariwj, Fypq Wbnypu" descr="P9"/>
                     <wps:cNvSpPr/>
                     <wps:spPr>
                       <a:xfrm>
-                        <a:off x="4946238" y="276176"/>
-                        <a:ext cx="238014" cy="139462"/>
+                        <a:off x="5116765" y="374623"/>
+                        <a:ext cx="210002" cy="159826"/>
                       </a:xfrm>
                       <a:prstGeom prst="roundRect">
                         <a:avLst/>
@@ -1960,12 +1960,12 @@
                               <w:color w:val="000000"/>
                               <w:sz w:val="4"/>
                             </w:rPr>
-                            <w:t xml:space="preserve">Erxriuy Ezfvqi&lt;br/&gt;Xqwvx, Dfyhs, Ariwj, Fypq Wbnypu</w:t>
+                            <w:t xml:space="preserve">Erxriuy Ezfvqi Xqwvx, Dfyhs, Ariwj, Fypq Wbnypu</w:t>
                           </w:r>
                         </w:p>
                       </w:txbxContent>
                     </wps:txbx>
-                    <wps:bodyPr rot="0" spcFirstLastPara="0" vertOverflow="overflow" horzOverflow="overflow" vert="horz" wrap="square" lIns="8114" tIns="4057" rIns="8114" bIns="4057" numCol="1" spcCol="0" rtlCol="0" fromWordArt="0" anchor="ctr" anchorCtr="0" forceAA="0" compatLnSpc="1">
+                    <wps:bodyPr rot="0" spcFirstLastPara="0" vertOverflow="overflow" horzOverflow="overflow" vert="horz" wrap="square" lIns="9299" tIns="4649" rIns="9299" bIns="4649" numCol="1" spcCol="0" rtlCol="0" fromWordArt="0" anchor="ctr" anchorCtr="0" forceAA="0" compatLnSpc="1">
                       <a:prstTxWarp prst="textNoShape">
                         <a:avLst/>
                       </a:prstTxWarp>
@@ -1973,12 +1973,12 @@
                     </wps:bodyPr>
                   </wps:wsp>
                   <wps:wsp>
-                    <wps:cNvPr id="44" name="Bhgwangl Lnquwua &amp;&lt;br/&gt;Vldnbrkpcl Hufgwibl" descr="Q10"/>
+                    <wps:cNvPr id="44" name="Bhgwangl Lnquwua &amp; Vldnbrkpcl Hufgwibl" descr="Q10"/>
                     <wps:cNvSpPr/>
                     <wps:spPr>
                       <a:xfrm>
-                        <a:off x="5319488" y="276176"/>
-                        <a:ext cx="223815" cy="139462"/>
+                        <a:off x="5481751" y="374623"/>
+                        <a:ext cx="172806" cy="159826"/>
                       </a:xfrm>
                       <a:prstGeom prst="rect">
                         <a:avLst/>
@@ -2021,12 +2021,12 @@
                               <w:color w:val="000000"/>
                               <w:sz w:val="4"/>
                             </w:rPr>
-                            <w:t xml:space="preserve">Bhgwangl Lnquwua &amp;&lt;br/&gt;Vldnbrkpcl Hufgwibl</w:t>
+                            <w:t xml:space="preserve">Bhgwangl Lnquwua &amp; Vldnbrkpcl Hufgwibl</w:t>
                           </w:r>
                         </w:p>
                       </w:txbxContent>
                     </wps:txbx>
-                    <wps:bodyPr rot="0" spcFirstLastPara="0" vertOverflow="overflow" horzOverflow="overflow" vert="horz" wrap="square" lIns="8114" tIns="4057" rIns="8114" bIns="4057" numCol="1" spcCol="0" rtlCol="0" fromWordArt="0" anchor="ctr" anchorCtr="0" forceAA="0" compatLnSpc="1">
+                    <wps:bodyPr rot="0" spcFirstLastPara="0" vertOverflow="overflow" horzOverflow="overflow" vert="horz" wrap="square" lIns="9299" tIns="4649" rIns="9299" bIns="4649" numCol="1" spcCol="0" rtlCol="0" fromWordArt="0" anchor="ctr" anchorCtr="0" forceAA="0" compatLnSpc="1">
                       <a:prstTxWarp prst="textNoShape">
                         <a:avLst/>
                       </a:prstTxWarp>
@@ -2034,12 +2034,12 @@
                     </wps:bodyPr>
                   </wps:wsp>
                   <wps:wsp>
-                    <wps:cNvPr id="45" name="Erxriuy Qgmzwpn&lt;br/&gt;Xdmnhhvkew Rzeel Bygarnbnp" descr="S10"/>
+                    <wps:cNvPr id="45" name="Erxriuy Qgmzwpn Xdmnhhvkew Rzeel Bygarnbnp" descr="S10"/>
                     <wps:cNvSpPr/>
                     <wps:spPr>
                       <a:xfrm>
-                        <a:off x="5610921" y="276176"/>
-                        <a:ext cx="298870" cy="139462"/>
+                        <a:off x="5732048" y="360093"/>
+                        <a:ext cx="172806" cy="188886"/>
                       </a:xfrm>
                       <a:prstGeom prst="roundRect">
                         <a:avLst/>
@@ -2082,12 +2082,12 @@
                               <w:color w:val="000000"/>
                               <w:sz w:val="4"/>
                             </w:rPr>
-                            <w:t xml:space="preserve">Erxriuy Qgmzwpn&lt;br/&gt;Xdmnhhvkew Rzeel Bygarnbnp</w:t>
+                            <w:t xml:space="preserve">Erxriuy Qgmzwpn Xdmnhhvkew Rzeel Bygarnbnp</w:t>
                           </w:r>
                         </w:p>
                       </w:txbxContent>
                     </wps:txbx>
-                    <wps:bodyPr rot="0" spcFirstLastPara="0" vertOverflow="overflow" horzOverflow="overflow" vert="horz" wrap="square" lIns="8114" tIns="4057" rIns="8114" bIns="4057" numCol="1" spcCol="0" rtlCol="0" fromWordArt="0" anchor="ctr" anchorCtr="0" forceAA="0" compatLnSpc="1">
+                    <wps:bodyPr rot="0" spcFirstLastPara="0" vertOverflow="overflow" horzOverflow="overflow" vert="horz" wrap="square" lIns="9299" tIns="4649" rIns="9299" bIns="4649" numCol="1" spcCol="0" rtlCol="0" fromWordArt="0" anchor="ctr" anchorCtr="0" forceAA="0" compatLnSpc="1">
                       <a:prstTxWarp prst="textNoShape">
                         <a:avLst/>
                       </a:prstTxWarp>
@@ -2095,15 +2095,76 @@
                     </wps:bodyPr>
                   </wps:wsp>
                   <wps:wsp>
-                    <wps:cNvPr id="46" name="E1--B1"/>
+                    <wps:cNvPr id="46" name="Furek Oonvow Zwcpyh = 11. IWXA Yoyesdxbhwr Pdmdx" descr="J_IGDA"/>
+                    <wps:cNvSpPr/>
+                    <wps:spPr>
+                      <a:xfrm>
+                        <a:off x="38746" y="595958"/>
+                        <a:ext cx="196054" cy="188886"/>
+                      </a:xfrm>
+                      <a:prstGeom prst="rect">
+                        <a:avLst/>
+                      </a:prstGeom>
+                      <a:solidFill>
+                        <a:srgbClr val="F3E5F5"/>
+                      </a:solidFill>
+                      <a:ln w="3175" cap="flat" cmpd="sng" algn="ctr">
+                        <a:solidFill>
+                          <a:srgbClr val="4A148C"/>
+                        </a:solidFill>
+                        <a:prstDash val="solid"/>
+                      </a:ln>
+                    </wps:spPr>
+                    <wps:style>
+                      <a:lnRef idx="2">
+                        <a:schemeClr val="accent1">
+                          <a:shade val="15000"/>
+                        </a:schemeClr>
+                      </a:lnRef>
+                      <a:fillRef idx="1">
+                        <a:schemeClr val="accent1"/>
+                      </a:fillRef>
+                      <a:effectRef idx="0">
+                        <a:schemeClr val="accent1"/>
+                      </a:effectRef>
+                      <a:fontRef idx="minor">
+                        <a:schemeClr val="lt1"/>
+                      </a:fontRef>
+                    </wps:style>
+                    <wps:txbx>
+                      <w:txbxContent>
+                        <w:p>
+                          <w:pPr>
+                            <w:spacing w:before="0" w:after="0"/>
+                            <w:jc w:val="center"/>
+                          </w:pPr>
+                          <w:r>
+                            <w:rPr>
+                              <w:color w:val="000000"/>
+                              <w:sz w:val="4"/>
+                            </w:rPr>
+                            <w:t xml:space="preserve">Furek Oonvow Zwcpyh = 11. IWXA Yoyesdxbhwr Pdmdx</w:t>
+                          </w:r>
+                        </w:p>
+                      </w:txbxContent>
+                    </wps:txbx>
+                    <wps:bodyPr rot="0" spcFirstLastPara="0" vertOverflow="overflow" horzOverflow="overflow" vert="horz" wrap="square" lIns="9299" tIns="4649" rIns="9299" bIns="4649" numCol="1" spcCol="0" rtlCol="0" fromWordArt="0" anchor="ctr" anchorCtr="0" forceAA="0" compatLnSpc="1">
+                      <a:prstTxWarp prst="textNoShape">
+                        <a:avLst/>
+                      </a:prstTxWarp>
+                      <a:noAutofit/>
+                    </wps:bodyPr>
+                  </wps:wsp>
+                  <wps:wsp>
+                    <wps:cNvPr id="47" name="E1--B1"/>
                     <wps:cNvCnPr>
                       <a:stCxn id="22" idx="3"/>
                       <a:endCxn id="24" idx="1"/>
                     </wps:cNvCnPr>
                     <wps:spPr>
                       <a:xfrm>
-                        <a:off x="190682" y="120655"/>
-                        <a:ext cx="67618" cy="63392"/>
+                        <a:off x="226663" y="114058"/>
+                        <a:ext cx="124374" cy="96864"/>
                       </a:xfrm>
                       <a:prstGeom prst="line">
                         <a:avLst/>
@@ -2133,15 +2194,15 @@
                     <wps:bodyPr/>
                   </wps:wsp>
                   <wps:wsp>
-                    <wps:cNvPr id="47" name="J2--B1"/>
+                    <wps:cNvPr id="48" name="J2--B1"/>
                     <wps:cNvCnPr>
                       <a:stCxn id="23" idx="3"/>
                       <a:endCxn id="24" idx="1"/>
                     </wps:cNvCnPr>
                     <wps:spPr>
                       <a:xfrm flipV="1">
-                        <a:off x="181554" y="184047"/>
-                        <a:ext cx="76746" cy="114105"/>
+                        <a:off x="216201" y="210922"/>
+                        <a:ext cx="134836" cy="106551"/>
                       </a:xfrm>
                       <a:prstGeom prst="line">
                         <a:avLst/>
@@ -2171,15 +2232,15 @@
                     <wps:bodyPr/>
                   </wps:wsp>
                   <wps:wsp>
-                    <wps:cNvPr id="48" name="B1--C1"/>
+                    <wps:cNvPr id="49" name="B1--C1"/>
                     <wps:cNvCnPr>
                       <a:stCxn id="24" idx="3"/>
                       <a:endCxn id="25" idx="1"/>
                     </wps:cNvCnPr>
                     <wps:spPr>
                       <a:xfrm>
-                        <a:off x="396916" y="184047"/>
-                        <a:ext cx="128474" cy="101427"/>
+                        <a:off x="509894" y="210922"/>
+                        <a:ext cx="80979" cy="92021"/>
                       </a:xfrm>
                       <a:prstGeom prst="line">
                         <a:avLst/>
@@ -2209,15 +2270,15 @@
                     <wps:bodyPr/>
                   </wps:wsp>
                   <wps:wsp>
-                    <wps:cNvPr id="49" name="B1--C1y"/>
+                    <wps:cNvPr id="50" name="B1--C1y"/>
                     <wps:cNvCnPr>
                       <a:stCxn id="24" idx="3"/>
                       <a:endCxn id="26" idx="1"/>
                     </wps:cNvCnPr>
                     <wps:spPr>
                       <a:xfrm flipV="1">
-                        <a:off x="396916" y="120655"/>
-                        <a:ext cx="67618" cy="63392"/>
+                        <a:off x="509894" y="114058"/>
+                        <a:ext cx="77492" cy="96864"/>
                       </a:xfrm>
                       <a:prstGeom prst="line">
                         <a:avLst/>
@@ -2247,15 +2308,15 @@
                     <wps:bodyPr/>
                   </wps:wsp>
                   <wps:wsp>
-                    <wps:cNvPr id="50" name="C1--S2"/>
+                    <wps:cNvPr id="51" name="C1--S2"/>
                     <wps:cNvCnPr>
                       <a:stCxn id="25" idx="3"/>
                       <a:endCxn id="27" idx="1"/>
                     </wps:cNvCnPr>
                     <wps:spPr>
                       <a:xfrm flipV="1">
-                        <a:off x="749205" y="184047"/>
-                        <a:ext cx="196091" cy="101427"/>
+                        <a:off x="796225" y="210922"/>
+                        <a:ext cx="158471" cy="92021"/>
                       </a:xfrm>
                       <a:prstGeom prst="line">
                         <a:avLst/>
@@ -2285,15 +2346,15 @@
                     <wps:bodyPr/>
                   </wps:wsp>
                   <wps:wsp>
-                    <wps:cNvPr id="51" name="C1y--S2"/>
+                    <wps:cNvPr id="52" name="C1y--S2"/>
                     <wps:cNvCnPr>
                       <a:stCxn id="26" idx="3"/>
                       <a:endCxn id="27" idx="1"/>
                     </wps:cNvCnPr>
                     <wps:spPr>
                       <a:xfrm>
-                        <a:off x="810061" y="120655"/>
-                        <a:ext cx="135235" cy="63392"/>
+                        <a:off x="799713" y="114058"/>
+                        <a:ext cx="154983" cy="96864"/>
                       </a:xfrm>
                       <a:prstGeom prst="line">
                         <a:avLst/>
@@ -2323,15 +2384,15 @@
                     <wps:bodyPr/>
                   </wps:wsp>
                   <wps:wsp>
-                    <wps:cNvPr id="52" name="S2--T2"/>
+                    <wps:cNvPr id="53" name="S2--T2"/>
                     <wps:cNvCnPr>
                       <a:stCxn id="27" idx="3"/>
                       <a:endCxn id="28" idx="1"/>
                     </wps:cNvCnPr>
                     <wps:spPr>
                       <a:xfrm>
-                        <a:off x="1059570" y="184047"/>
-                        <a:ext cx="67618" cy="0"/>
+                        <a:off x="1085656" y="210922"/>
+                        <a:ext cx="77492" cy="0"/>
                       </a:xfrm>
                       <a:prstGeom prst="line">
                         <a:avLst/>
@@ -2361,15 +2422,15 @@
                     <wps:bodyPr/>
                   </wps:wsp>
                   <wps:wsp>
-                    <wps:cNvPr id="53" name="T2--B3"/>
+                    <wps:cNvPr id="54" name="T2--B3"/>
                     <wps:cNvCnPr>
                       <a:stCxn id="28" idx="3"/>
                       <a:endCxn id="29" idx="1"/>
                     </wps:cNvCnPr>
                     <wps:spPr>
                       <a:xfrm>
-                        <a:off x="1399687" y="184047"/>
-                        <a:ext cx="135236" cy="73112"/>
+                        <a:off x="1359201" y="210922"/>
+                        <a:ext cx="154983" cy="82577"/>
                       </a:xfrm>
                       <a:prstGeom prst="line">
                         <a:avLst/>
@@ -2399,15 +2460,15 @@
                     <wps:bodyPr/>
                   </wps:wsp>
                   <wps:wsp>
-                    <wps:cNvPr id="54" name="B3--N3"/>
+                    <wps:cNvPr id="55" name="B3--N3"/>
                     <wps:cNvCnPr>
                       <a:stCxn id="29" idx="3"/>
                       <a:endCxn id="30" idx="1"/>
                     </wps:cNvCnPr>
                     <wps:spPr>
                       <a:xfrm>
-                        <a:off x="1809451" y="257159"/>
-                        <a:ext cx="67618" cy="0"/>
+                        <a:off x="1659094" y="293499"/>
+                        <a:ext cx="77491" cy="0"/>
                       </a:xfrm>
                       <a:prstGeom prst="line">
                         <a:avLst/>
@@ -2437,15 +2498,15 @@
                     <wps:bodyPr/>
                   </wps:wsp>
                   <wps:wsp>
-                    <wps:cNvPr id="55" name="N3--B4"/>
+                    <wps:cNvPr id="56" name="N3--B4"/>
                     <wps:cNvCnPr>
                       <a:stCxn id="30" idx="3"/>
                       <a:endCxn id="31" idx="1"/>
                     </wps:cNvCnPr>
                     <wps:spPr>
                       <a:xfrm>
-                        <a:off x="2027856" y="257159"/>
-                        <a:ext cx="67618" cy="63391"/>
+                        <a:off x="1909391" y="293499"/>
+                        <a:ext cx="77492" cy="52065"/>
                       </a:xfrm>
                       <a:prstGeom prst="line">
                         <a:avLst/>
@@ -2475,15 +2536,15 @@
                     <wps:bodyPr/>
                   </wps:wsp>
                   <wps:wsp>
-                    <wps:cNvPr id="56" name="B4--L4"/>
+                    <wps:cNvPr id="57" name="B4--L4"/>
                     <wps:cNvCnPr>
                       <a:stCxn id="31" idx="3"/>
                       <a:endCxn id="32" idx="1"/>
                     </wps:cNvCnPr>
                     <wps:spPr>
                       <a:xfrm>
-                        <a:off x="2270604" y="320550"/>
-                        <a:ext cx="67618" cy="0"/>
+                        <a:off x="2187586" y="345564"/>
+                        <a:ext cx="77491" cy="0"/>
                       </a:xfrm>
                       <a:prstGeom prst="line">
                         <a:avLst/>
@@ -2513,15 +2574,15 @@
                     <wps:bodyPr/>
                   </wps:wsp>
                   <wps:wsp>
-                    <wps:cNvPr id="57" name="T2--X5"/>
+                    <wps:cNvPr id="58" name="T2--X5"/>
                     <wps:cNvCnPr>
                       <a:stCxn id="28" idx="3"/>
                       <a:endCxn id="33" idx="1"/>
                     </wps:cNvCnPr>
                     <wps:spPr>
                       <a:xfrm flipV="1">
-                        <a:off x="1399687" y="163128"/>
-                        <a:ext cx="1167083" cy="20919"/>
+                        <a:off x="1359201" y="165154"/>
+                        <a:ext cx="1186396" cy="45768"/>
                       </a:xfrm>
                       <a:prstGeom prst="line">
                         <a:avLst/>
@@ -2551,15 +2612,15 @@
                     <wps:bodyPr/>
                   </wps:wsp>
                   <wps:wsp>
-                    <wps:cNvPr id="58" name="L4--X5"/>
+                    <wps:cNvPr id="59" name="L4--X5"/>
                     <wps:cNvCnPr>
                       <a:stCxn id="32" idx="3"/>
                       <a:endCxn id="33" idx="1"/>
                     </wps:cNvCnPr>
                     <wps:spPr>
                       <a:xfrm flipV="1">
-                        <a:off x="2499152" y="163128"/>
-                        <a:ext cx="67618" cy="157422"/>
+                        <a:off x="2468105" y="165154"/>
+                        <a:ext cx="77492" cy="180410"/>
                       </a:xfrm>
                       <a:prstGeom prst="line">
                         <a:avLst/>
@@ -2589,15 +2650,15 @@
                     <wps:bodyPr/>
                   </wps:wsp>
                   <wps:wsp>
-                    <wps:cNvPr id="59" name="N3--X5"/>
+                    <wps:cNvPr id="60" name="N3--X5"/>
                     <wps:cNvCnPr>
                       <a:stCxn id="30" idx="3"/>
                       <a:endCxn id="33" idx="1"/>
                     </wps:cNvCnPr>
                     <wps:spPr>
                       <a:xfrm flipV="1">
-                        <a:off x="2027856" y="163128"/>
-                        <a:ext cx="538914" cy="94031"/>
+                        <a:off x="1909391" y="165154"/>
+                        <a:ext cx="636206" cy="128345"/>
                       </a:xfrm>
                       <a:prstGeom prst="line">
                         <a:avLst/>
@@ -2627,15 +2688,15 @@
                     <wps:bodyPr/>
                   </wps:wsp>
                   <wps:wsp>
-                    <wps:cNvPr id="60" name="X5--N5"/>
+                    <wps:cNvPr id="61" name="X5--N5"/>
                     <wps:cNvCnPr>
                       <a:stCxn id="33" idx="3"/>
                       <a:endCxn id="34" idx="1"/>
                     </wps:cNvCnPr>
                     <wps:spPr>
                       <a:xfrm>
-                        <a:off x="2717557" y="163128"/>
-                        <a:ext cx="101427" cy="0"/>
+                        <a:off x="2718403" y="165154"/>
+                        <a:ext cx="116237" cy="0"/>
                       </a:xfrm>
                       <a:prstGeom prst="line">
                         <a:avLst/>
@@ -2665,15 +2726,15 @@
                     <wps:bodyPr/>
                   </wps:wsp>
                   <wps:wsp>
-                    <wps:cNvPr id="61" name="Ewztn--Kjj"/>
+                    <wps:cNvPr id="62" name="Ewztn--Kjj"/>
                     <wps:cNvCnPr>
                       <a:stCxn id="35" idx="3"/>
                       <a:endCxn id="36" idx="1"/>
                     </wps:cNvCnPr>
                     <wps:spPr>
                       <a:xfrm flipV="1">
-                        <a:off x="3055984" y="571159"/>
-                        <a:ext cx="199811" cy="39091"/>
+                        <a:off x="3028369" y="683621"/>
+                        <a:ext cx="151108" cy="61751"/>
                       </a:xfrm>
                       <a:prstGeom prst="line">
                         <a:avLst/>
@@ -2703,15 +2764,15 @@
                     <wps:bodyPr/>
                   </wps:wsp>
                   <wps:wsp>
-                    <wps:cNvPr id="62" name="N5--Kjj"/>
+                    <wps:cNvPr id="63" name="N5--Kjj"/>
                     <wps:cNvCnPr>
                       <a:stCxn id="34" idx="2"/>
                       <a:endCxn id="36" idx="0"/>
                     </wps:cNvCnPr>
                     <wps:spPr>
                       <a:xfrm>
-                        <a:off x="2986676" y="232859"/>
-                        <a:ext cx="338427" cy="306604"/>
+                        <a:off x="2948940" y="245067"/>
+                        <a:ext cx="309966" cy="402229"/>
                       </a:xfrm>
                       <a:prstGeom prst="line">
                         <a:avLst/>
@@ -2741,15 +2802,15 @@
                     <wps:bodyPr/>
                   </wps:wsp>
                   <wps:wsp>
-                    <wps:cNvPr id="63" name="Kjj--R6d"/>
+                    <wps:cNvPr id="64" name="Kjj--R6d"/>
                     <wps:cNvCnPr>
                       <a:stCxn id="36" idx="3"/>
                       <a:endCxn id="37" idx="1"/>
                     </wps:cNvCnPr>
                     <wps:spPr>
                       <a:xfrm>
-                        <a:off x="3394411" y="571159"/>
-                        <a:ext cx="67618" cy="0"/>
+                        <a:off x="3338335" y="683621"/>
+                        <a:ext cx="77491" cy="0"/>
                       </a:xfrm>
                       <a:prstGeom prst="line">
                         <a:avLst/>
@@ -2779,15 +2840,15 @@
                     <wps:bodyPr/>
                   </wps:wsp>
                   <wps:wsp>
-                    <wps:cNvPr id="64" name="N5--Mbkj"/>
+                    <wps:cNvPr id="65" name="N5--Mbkj"/>
                     <wps:cNvCnPr>
                       <a:stCxn id="34" idx="3"/>
                       <a:endCxn id="38" idx="1"/>
                     </wps:cNvCnPr>
                     <wps:spPr>
                       <a:xfrm>
-                        <a:off x="3154368" y="114105"/>
-                        <a:ext cx="513895" cy="496145"/>
+                        <a:off x="3063240" y="118659"/>
+                        <a:ext cx="588936" cy="626713"/>
                       </a:xfrm>
                       <a:custGeom>
                         <a:avLst/>
@@ -2796,30 +2857,30 @@
                         <a:cxnLst/>
                         <a:rect l="0" t="0" r="0" b="0"/>
                         <a:pathLst>
-                          <a:path w="513895" h="496145">
+                          <a:path w="588936" h="626713">
                             <a:moveTo>
-                              <a:pt x="0" y="49023"/>
+                              <a:pt x="0" y="46495"/>
                             </a:moveTo>
                             <a:lnTo>
-                              <a:pt x="33809" y="0"/>
+                              <a:pt x="38746" y="0"/>
                             </a:lnTo>
                             <a:lnTo>
-                              <a:pt x="67618" y="303223"/>
+                              <a:pt x="77492" y="388668"/>
                             </a:lnTo>
                             <a:lnTo>
-                              <a:pt x="170735" y="303223"/>
+                              <a:pt x="195666" y="388668"/>
                             </a:lnTo>
                             <a:lnTo>
-                              <a:pt x="273852" y="303223"/>
+                              <a:pt x="313841" y="388668"/>
                             </a:lnTo>
                             <a:lnTo>
-                              <a:pt x="376969" y="303223"/>
+                              <a:pt x="432015" y="388668"/>
                             </a:lnTo>
                             <a:lnTo>
-                              <a:pt x="480086" y="303223"/>
+                              <a:pt x="550190" y="388668"/>
                             </a:lnTo>
                             <a:lnTo>
-                              <a:pt x="513895" y="496145"/>
+                              <a:pt x="588936" y="626713"/>
                             </a:lnTo>
                           </a:path>
                         </a:pathLst>
@@ -2849,15 +2910,15 @@
                     <wps:bodyPr/>
                   </wps:wsp>
                   <wps:wsp>
-                    <wps:cNvPr id="65" name="R6d--Mbkj"/>
+                    <wps:cNvPr id="66" name="R6d--Mbkj"/>
                     <wps:cNvCnPr>
                       <a:stCxn id="37" idx="3"/>
                       <a:endCxn id="38" idx="1"/>
                     </wps:cNvCnPr>
                     <wps:spPr>
                       <a:xfrm>
-                        <a:off x="3600645" y="571159"/>
-                        <a:ext cx="67618" cy="39091"/>
+                        <a:off x="3574684" y="683621"/>
+                        <a:ext cx="77492" cy="61751"/>
                       </a:xfrm>
                       <a:prstGeom prst="line">
                         <a:avLst/>
@@ -2887,15 +2948,15 @@
                     <wps:bodyPr/>
                   </wps:wsp>
                   <wps:wsp>
-                    <wps:cNvPr id="66" name="Mbkj--F6i"/>
+                    <wps:cNvPr id="67" name="Mbkj--F6i"/>
                     <wps:cNvCnPr>
                       <a:stCxn id="38" idx="3"/>
                       <a:endCxn id="39" idx="1"/>
                     </wps:cNvCnPr>
                     <wps:spPr>
                       <a:xfrm>
-                        <a:off x="3855564" y="610250"/>
-                        <a:ext cx="67618" cy="0"/>
+                        <a:off x="3866827" y="745372"/>
+                        <a:ext cx="77492" cy="0"/>
                       </a:xfrm>
                       <a:prstGeom prst="line">
                         <a:avLst/>
@@ -2925,15 +2986,15 @@
                     <wps:bodyPr/>
                   </wps:wsp>
                   <wps:wsp>
-                    <wps:cNvPr id="67" name="L4--D8"/>
+                    <wps:cNvPr id="68" name="L4--D8"/>
                     <wps:cNvCnPr>
                       <a:stCxn id="32" idx="3"/>
                       <a:endCxn id="40" idx="1"/>
                     </wps:cNvCnPr>
                     <wps:spPr>
                       <a:xfrm>
-                        <a:off x="2499152" y="320550"/>
-                        <a:ext cx="1685710" cy="134179"/>
+                        <a:off x="2468105" y="345564"/>
+                        <a:ext cx="1776106" cy="291804"/>
                       </a:xfrm>
                       <a:prstGeom prst="line">
                         <a:avLst/>
@@ -2963,12 +3024,12 @@
                     <wps:bodyPr/>
                   </wps:wsp>
                   <wps:wsp>
-                    <wps:cNvPr id="68" name="EdgeLabel"/>
+                    <wps:cNvPr id="69" name="EdgeLabel"/>
                     <wps:cNvSpPr txBox="1"/>
                     <wps:spPr>
                       <a:xfrm>
-                        <a:off x="3292241" y="377497"/>
-                        <a:ext cx="99533" cy="20285"/>
+                        <a:off x="3299124" y="479842"/>
+                        <a:ext cx="114068" cy="23247"/>
                       </a:xfrm>
                       <a:prstGeom prst="rect">
                         <a:avLst/>
@@ -2997,20 +3058,20 @@
                         </w:p>
                       </w:txbxContent>
                     </wps:txbx>
-                    <wps:bodyPr rot="0" vert="horz" wrap="none" lIns="3381" tIns="0" rIns="3381" bIns="0" anchor="ctr" anchorCtr="1">
+                    <wps:bodyPr rot="0" vert="horz" wrap="none" lIns="3875" tIns="0" rIns="3875" bIns="0" anchor="ctr" anchorCtr="1">
                       <a:noAutofit/>
                     </wps:bodyPr>
                   </wps:wsp>
                   <wps:wsp>
-                    <wps:cNvPr id="69" name="R6d--D8"/>
+                    <wps:cNvPr id="70" name="R6d--D8"/>
                     <wps:cNvCnPr>
                       <a:stCxn id="37" idx="3"/>
                       <a:endCxn id="40" idx="1"/>
                     </wps:cNvCnPr>
                     <wps:spPr>
                       <a:xfrm flipV="1">
-                        <a:off x="3600645" y="454729"/>
-                        <a:ext cx="584217" cy="116430"/>
+                        <a:off x="3574684" y="637368"/>
+                        <a:ext cx="669527" cy="46253"/>
                       </a:xfrm>
                       <a:prstGeom prst="line">
                         <a:avLst/>
@@ -3040,12 +3101,12 @@
                     <wps:bodyPr/>
                   </wps:wsp>
                   <wps:wsp>
-                    <wps:cNvPr id="70" name="EdgeLabel"/>
+                    <wps:cNvPr id="71" name="EdgeLabel"/>
                     <wps:cNvSpPr txBox="1"/>
                     <wps:spPr>
                       <a:xfrm>
-                        <a:off x="3842987" y="502802"/>
-                        <a:ext cx="99533" cy="20285"/>
+                        <a:off x="3852413" y="648871"/>
+                        <a:ext cx="114068" cy="23247"/>
                       </a:xfrm>
                       <a:prstGeom prst="rect">
                         <a:avLst/>
@@ -3074,20 +3135,20 @@
                         </w:p>
                       </w:txbxContent>
                     </wps:txbx>
-                    <wps:bodyPr rot="0" vert="horz" wrap="none" lIns="3381" tIns="0" rIns="3381" bIns="0" anchor="ctr" anchorCtr="1">
+                    <wps:bodyPr rot="0" vert="horz" wrap="none" lIns="3875" tIns="0" rIns="3875" bIns="0" anchor="ctr" anchorCtr="1">
                       <a:noAutofit/>
                     </wps:bodyPr>
                   </wps:wsp>
                   <wps:wsp>
-                    <wps:cNvPr id="71" name="F6i--D8"/>
+                    <wps:cNvPr id="72" name="F6i--D8"/>
                     <wps:cNvCnPr>
                       <a:stCxn id="39" idx="3"/>
                       <a:endCxn id="40" idx="1"/>
                     </wps:cNvCnPr>
                     <wps:spPr>
                       <a:xfrm flipV="1">
-                        <a:off x="4049627" y="454729"/>
-                        <a:ext cx="135235" cy="155521"/>
+                        <a:off x="4089228" y="637368"/>
+                        <a:ext cx="154983" cy="108004"/>
                       </a:xfrm>
                       <a:prstGeom prst="line">
                         <a:avLst/>
@@ -3117,12 +3178,12 @@
                     <wps:bodyPr/>
                   </wps:wsp>
                   <wps:wsp>
-                    <wps:cNvPr id="72" name="EdgeLabel"/>
+                    <wps:cNvPr id="73" name="EdgeLabel"/>
                     <wps:cNvSpPr txBox="1"/>
                     <wps:spPr>
                       <a:xfrm>
-                        <a:off x="4065855" y="522347"/>
-                        <a:ext cx="102779" cy="20285"/>
+                        <a:off x="4107826" y="679746"/>
+                        <a:ext cx="117787" cy="23247"/>
                       </a:xfrm>
                       <a:prstGeom prst="rect">
                         <a:avLst/>
@@ -3151,20 +3212,20 @@
                         </w:p>
                       </w:txbxContent>
                     </wps:txbx>
-                    <wps:bodyPr rot="0" vert="horz" wrap="none" lIns="3381" tIns="0" rIns="3381" bIns="0" anchor="ctr" anchorCtr="1">
+                    <wps:bodyPr rot="0" vert="horz" wrap="none" lIns="3875" tIns="0" rIns="3875" bIns="0" anchor="ctr" anchorCtr="1">
                       <a:noAutofit/>
                     </wps:bodyPr>
                   </wps:wsp>
                   <wps:wsp>
-                    <wps:cNvPr id="73" name="D8--W8"/>
+                    <wps:cNvPr id="74" name="D8--W8"/>
                     <wps:cNvCnPr>
                       <a:stCxn id="40" idx="3"/>
                       <a:endCxn id="41" idx="1"/>
                     </wps:cNvCnPr>
                     <wps:spPr>
                       <a:xfrm>
-                        <a:off x="4366078" y="454729"/>
-                        <a:ext cx="67618" cy="0"/>
+                        <a:off x="4451888" y="637368"/>
+                        <a:ext cx="77492" cy="0"/>
                       </a:xfrm>
                       <a:prstGeom prst="line">
                         <a:avLst/>
@@ -3194,15 +3255,15 @@
                     <wps:bodyPr/>
                   </wps:wsp>
                   <wps:wsp>
-                    <wps:cNvPr id="74" name="N5--W9"/>
+                    <wps:cNvPr id="75" name="N5--W9"/>
                     <wps:cNvCnPr>
                       <a:stCxn id="34" idx="3"/>
                       <a:endCxn id="42" idx="1"/>
                     </wps:cNvCnPr>
                     <wps:spPr>
                       <a:xfrm>
-                        <a:off x="3154368" y="163128"/>
-                        <a:ext cx="1597807" cy="182779"/>
+                        <a:off x="3063240" y="165154"/>
+                        <a:ext cx="1831125" cy="289382"/>
                       </a:xfrm>
                       <a:prstGeom prst="line">
                         <a:avLst/>
@@ -3232,15 +3293,15 @@
                     <wps:bodyPr/>
                   </wps:wsp>
                   <wps:wsp>
-                    <wps:cNvPr id="75" name="W8--W9"/>
+                    <wps:cNvPr id="76" name="W8--W9"/>
                     <wps:cNvCnPr>
                       <a:stCxn id="41" idx="3"/>
                       <a:endCxn id="42" idx="1"/>
                     </wps:cNvCnPr>
                     <wps:spPr>
                       <a:xfrm flipV="1">
-                        <a:off x="4616940" y="345907"/>
-                        <a:ext cx="135235" cy="108822"/>
+                        <a:off x="4739382" y="454536"/>
+                        <a:ext cx="154983" cy="182832"/>
                       </a:xfrm>
                       <a:prstGeom prst="line">
                         <a:avLst/>
@@ -3270,15 +3331,15 @@
                     <wps:bodyPr/>
                   </wps:wsp>
                   <wps:wsp>
-                    <wps:cNvPr id="76" name="W9--P9"/>
+                    <wps:cNvPr id="77" name="W9--P9"/>
                     <wps:cNvCnPr>
                       <a:stCxn id="42" idx="3"/>
                       <a:endCxn id="43" idx="1"/>
                     </wps:cNvCnPr>
                     <wps:spPr>
                       <a:xfrm>
-                        <a:off x="4878620" y="345907"/>
-                        <a:ext cx="67618" cy="0"/>
+                        <a:off x="5039274" y="454536"/>
+                        <a:ext cx="77491" cy="0"/>
                       </a:xfrm>
                       <a:prstGeom prst="line">
                         <a:avLst/>
@@ -3308,15 +3369,15 @@
                     <wps:bodyPr/>
                   </wps:wsp>
                   <wps:wsp>
-                    <wps:cNvPr id="77" name="P9--Q10"/>
+                    <wps:cNvPr id="78" name="P9--Q10"/>
                     <wps:cNvCnPr>
                       <a:stCxn id="43" idx="3"/>
                       <a:endCxn id="44" idx="1"/>
                     </wps:cNvCnPr>
                     <wps:spPr>
                       <a:xfrm>
-                        <a:off x="5184253" y="345907"/>
-                        <a:ext cx="135235" cy="0"/>
+                        <a:off x="5326767" y="454536"/>
+                        <a:ext cx="154984" cy="0"/>
                       </a:xfrm>
                       <a:prstGeom prst="line">
                         <a:avLst/>
@@ -3346,15 +3407,15 @@
                     <wps:bodyPr/>
                   </wps:wsp>
                   <wps:wsp>
-                    <wps:cNvPr id="78" name="Q10--Q10"/>
+                    <wps:cNvPr id="79" name="Q10--Q10"/>
                     <wps:cNvCnPr>
                       <a:stCxn id="44" idx="0"/>
                       <a:endCxn id="44" idx="2"/>
                     </wps:cNvCnPr>
                     <wps:spPr>
                       <a:xfrm>
-                        <a:off x="5431396" y="276176"/>
-                        <a:ext cx="0" cy="139462"/>
+                        <a:off x="5568154" y="374623"/>
+                        <a:ext cx="0" cy="159826"/>
                       </a:xfrm>
                       <a:prstGeom prst="line">
                         <a:avLst/>
@@ -3384,12 +3445,12 @@
                     <wps:bodyPr/>
                   </wps:wsp>
                   <wps:wsp>
-                    <wps:cNvPr id="79" name="EdgeLabel"/>
+                    <wps:cNvPr id="80" name="EdgeLabel"/>
                     <wps:cNvSpPr txBox="1"/>
                     <wps:spPr>
                       <a:xfrm>
-                        <a:off x="5345116" y="335765"/>
-                        <a:ext cx="172560" cy="20285"/>
+                        <a:off x="5469275" y="442913"/>
+                        <a:ext cx="197758" cy="23247"/>
                       </a:xfrm>
                       <a:prstGeom prst="rect">
                         <a:avLst/>
@@ -3418,20 +3479,20 @@
                         </w:p>
                       </w:txbxContent>
                     </wps:txbx>
-                    <wps:bodyPr rot="0" vert="horz" wrap="none" lIns="3381" tIns="0" rIns="3381" bIns="0" anchor="ctr" anchorCtr="1">
+                    <wps:bodyPr rot="0" vert="horz" wrap="none" lIns="3875" tIns="0" rIns="3875" bIns="0" anchor="ctr" anchorCtr="1">
                       <a:noAutofit/>
                     </wps:bodyPr>
                   </wps:wsp>
                   <wps:wsp>
-                    <wps:cNvPr id="80" name="Q10--S10"/>
+                    <wps:cNvPr id="81" name="Q10--S10"/>
                     <wps:cNvCnPr>
                       <a:stCxn id="44" idx="3"/>
                       <a:endCxn id="45" idx="1"/>
                     </wps:cNvCnPr>
                     <wps:spPr>
                       <a:xfrm>
-                        <a:off x="5543303" y="345907"/>
-                        <a:ext cx="67618" cy="0"/>
+                        <a:off x="5654557" y="454536"/>
+                        <a:ext cx="77491" cy="0"/>
                       </a:xfrm>
                       <a:prstGeom prst="line">
                         <a:avLst/>

</xml_diff>